<commit_message>
Auto-delete NotebookLM notebooks after use to prevent library clutter
generate_background_candidates() now deletes its notebook once all
candidate images are downloaded (success or not), via a best-effort
delete_notebook() helper - a cleanup failure is logged, not fatal.
Opt out with cleanup_notebook=False to keep a notebook around for
follow-up regeneration against the same uploaded source.

Verified end-to-end: create -> delete -> confirmed gone via nlm notebook get.
</commit_message>
<xml_diff>
--- a/docs/Committee_Automator_Setup_Guide.docx
+++ b/docs/Committee_Automator_Setup_Guide.docx
@@ -1636,13 +1636,26 @@
     </w:p>
     <w:p>
       <w:pPr>
+        <w:pStyle w:val="ListParagraph"/>
+        <w:numPr>
+          <w:ilvl w:val="0"/>
+          <w:numId w:val="2"/>
+        </w:numPr>
+        <w:spacing w:after="80"/>
+      </w:pPr>
+      <w:r>
+        <w:t xml:space="preserve">nlm notebook delete — by default, runs automatically once the images are downloaded, so the notebook doesn't linger in your NotebookLM library</w:t>
+      </w:r>
+    </w:p>
+    <w:p>
+      <w:pPr>
         <w:spacing w:after="160"/>
       </w:pPr>
       <w:r>
         <w:rPr>
           <w:rFonts w:ascii="Calibri" w:cs="Calibri" w:eastAsia="Calibri" w:hAnsi="Calibri"/>
         </w:rPr>
-        <w:t xml:space="preserve">Notebook cleanup is not automatic — old notebooks accumulate in your NotebookLM library over time; delete them from notebooklm.google.com periodically if that bothers you.</w:t>
+        <w:t xml:space="preserve">Cleanup is best-effort: a delete failure is logged, not fatal, and the pipeline keeps going (that notebook is just left behind). To keep a notebook around instead — e.g. to generate more variants against the same uploaded source later without re-uploading it — call generate_background_candidates(..., cleanup_notebook=False).</w:t>
       </w:r>
     </w:p>
     <w:p>

</xml_diff>